<commit_message>
manual: drop industry references
</commit_message>
<xml_diff>
--- a/docs/LAMPOCHKA_Manual_RU.docx
+++ b/docs/LAMPOCHKA_Manual_RU.docx
@@ -1748,7 +1748,7 @@
           <w:rPr>
             <w:rStyle w:val="Hyperlink"/>
           </w:rPr>
-          <w:t>12.4 Продакшн-привычки</w:t>
+          <w:t>12.4 Рабочие привычки</w:t>
         </w:r>
         <w:r>
           <w:tab/>
@@ -4595,7 +4595,7 @@
           <w:i w:val="0"/>
           <w:sz w:val="19"/>
         </w:rPr>
-        <w:t>Камере показывается плоский цвет (по умолчанию чёрный), а освещение и отражения остаются от HDRI. Классический VFX-приём: рендер на чистой болванке без фотосъёмки фона.</w:t>
+        <w:t>Камере показывается плоский цвет (по умолчанию чёрный), а освещение и отражения остаются от HDRI. Пригодится, когда фон в кадре не нужен: рендер на чистой болванке с настоящим освещением.</w:t>
       </w:r>
     </w:p>
     <w:p>
@@ -4852,7 +4852,7 @@
           <w:i w:val="0"/>
           <w:sz w:val="19"/>
         </w:rPr>
-        <w:t>Суб-панель Gobo проецирует текстуру из активного светильника: паттерн жалюзи, листвы, оконной рамы - классический киношный приём для оживления кадра. Укажите папку с текстурами - появятся сеткой превью, Apply применяет выбранную.</w:t>
+        <w:t>Суб-панель Gobo проецирует текстуру из активного светильника: паттерн жалюзи, листвы, оконной рамы - рисунок поверх основного света, который оживляет кадр. Укажите папку с текстурами - появятся сеткой превью, Apply применяет выбранную.</w:t>
       </w:r>
     </w:p>
     <w:tbl>
@@ -5551,7 +5551,7 @@
       </w:pPr>
       <w:bookmarkStart w:id="100046" w:name="_Toc100046"/>
       <w:r>
-        <w:t>12.4 Продакшн-привычки</w:t>
+        <w:t>12.4 Рабочие привычки</w:t>
       </w:r>
       <w:bookmarkEnd w:id="100046"/>
     </w:p>

</xml_diff>